<commit_message>
Post_to_researcher: QR 양끝 배치, 봉투 구성 결정 기록
Co-Authored-By: Claude Fable 5.1 <noreply@anthropic.com>
</commit_message>
<xml_diff>
--- a/Post_to_researcher/Minseok_Cho_CV_print.docx
+++ b/Post_to_researcher/Minseok_Cho_CV_print.docx
@@ -24,19 +24,18 @@
       <w:tr>
         <w:tc>
           <w:tcPr>
-            <w:tcW w:type="dxa" w:w="1584"/>
+            <w:tcW w:type="dxa" w:w="3168"/>
             <w:vAlign w:val="center"/>
           </w:tcPr>
           <w:p>
             <w:pPr>
               <w:spacing w:before="0" w:after="0" w:line="276" w:lineRule="auto"/>
-              <w:jc w:val="left"/>
             </w:pPr>
             <w:r>
               <w:drawing>
                 <wp:inline xmlns:a="http://schemas.openxmlformats.org/drawingml/2006/main" xmlns:pic="http://schemas.openxmlformats.org/drawingml/2006/picture">
                   <wp:extent cx="1005840" cy="1319784"/>
-                  <wp:docPr id="3" name="Picture 3"/>
+                  <wp:docPr id="1" name="Picture 1"/>
                   <wp:cNvGraphicFramePr>
                     <a:graphicFrameLocks noChangeAspect="1"/>
                   </wp:cNvGraphicFramePr>
@@ -48,7 +47,7 @@
                           <pic:cNvPicPr/>
                         </pic:nvPicPr>
                         <pic:blipFill>
-                          <a:blip r:embed="rId11"/>
+                          <a:blip r:embed="rId9"/>
                           <a:stretch>
                             <a:fillRect/>
                           </a:stretch>
@@ -66,11 +65,62 @@
                 </wp:inline>
               </w:drawing>
             </w:r>
+            <w:r>
+              <w:t xml:space="preserve">   </w:t>
+            </w:r>
+            <w:r>
+              <w:drawing>
+                <wp:inline xmlns:a="http://schemas.openxmlformats.org/drawingml/2006/main" xmlns:pic="http://schemas.openxmlformats.org/drawingml/2006/picture">
+                  <wp:extent cx="731520" cy="731520"/>
+                  <wp:docPr id="2" name="Picture 2"/>
+                  <wp:cNvGraphicFramePr>
+                    <a:graphicFrameLocks noChangeAspect="1"/>
+                  </wp:cNvGraphicFramePr>
+                  <a:graphic>
+                    <a:graphicData uri="http://schemas.openxmlformats.org/drawingml/2006/picture">
+                      <pic:pic>
+                        <pic:nvPicPr>
+                          <pic:cNvPr id="0" name="qr_site.png"/>
+                          <pic:cNvPicPr/>
+                        </pic:nvPicPr>
+                        <pic:blipFill>
+                          <a:blip r:embed="rId10"/>
+                          <a:stretch>
+                            <a:fillRect/>
+                          </a:stretch>
+                        </pic:blipFill>
+                        <pic:spPr>
+                          <a:xfrm>
+                            <a:off x="0" y="0"/>
+                            <a:ext cx="731520" cy="731520"/>
+                          </a:xfrm>
+                          <a:prstGeom prst="rect"/>
+                        </pic:spPr>
+                      </pic:pic>
+                    </a:graphicData>
+                  </a:graphic>
+                </wp:inline>
+              </w:drawing>
+            </w:r>
+          </w:p>
+          <w:p>
+            <w:pPr>
+              <w:spacing w:before="0" w:after="0" w:line="276" w:lineRule="auto"/>
+            </w:pPr>
+            <w:r>
+              <w:rPr>
+                <w:rFonts w:ascii="Open Sans" w:hAnsi="Open Sans" w:eastAsia="Open Sans"/>
+                <w:b w:val="0"/>
+                <w:color w:val="444444"/>
+                <w:sz w:val="15"/>
+              </w:rPr>
+              <w:t xml:space="preserve">                                  Résumé</w:t>
+            </w:r>
           </w:p>
         </w:tc>
         <w:tc>
           <w:tcPr>
-            <w:tcW w:type="dxa" w:w="6480"/>
+            <w:tcW w:type="dxa" w:w="6192"/>
             <w:vAlign w:val="center"/>
           </w:tcPr>
           <w:p>
@@ -132,7 +182,7 @@
         </w:tc>
         <w:tc>
           <w:tcPr>
-            <w:tcW w:type="dxa" w:w="2736"/>
+            <w:tcW w:type="dxa" w:w="1440"/>
             <w:vAlign w:val="center"/>
           </w:tcPr>
           <w:p>
@@ -144,7 +194,7 @@
               <w:drawing>
                 <wp:inline xmlns:a="http://schemas.openxmlformats.org/drawingml/2006/main" xmlns:pic="http://schemas.openxmlformats.org/drawingml/2006/picture">
                   <wp:extent cx="731520" cy="731520"/>
-                  <wp:docPr id="1" name="Picture 1"/>
+                  <wp:docPr id="3" name="Picture 3"/>
                   <wp:cNvGraphicFramePr>
                     <a:graphicFrameLocks noChangeAspect="1"/>
                   </wp:cNvGraphicFramePr>
@@ -152,11 +202,11 @@
                     <a:graphicData uri="http://schemas.openxmlformats.org/drawingml/2006/picture">
                       <pic:pic>
                         <pic:nvPicPr>
-                          <pic:cNvPr id="0" name="qr_site.png"/>
+                          <pic:cNvPr id="0" name="qr_mail.png"/>
                           <pic:cNvPicPr/>
                         </pic:nvPicPr>
                         <pic:blipFill>
-                          <a:blip r:embed="rId9"/>
+                          <a:blip r:embed="rId11"/>
                           <a:stretch>
                             <a:fillRect/>
                           </a:stretch>
@@ -174,46 +224,6 @@
                 </wp:inline>
               </w:drawing>
             </w:r>
-            <w:r>
-              <w:t xml:space="preserve">  </w:t>
-            </w:r>
-            <w:r>
-              <w:drawing>
-                <wp:inline xmlns:a="http://schemas.openxmlformats.org/drawingml/2006/main" xmlns:pic="http://schemas.openxmlformats.org/drawingml/2006/picture">
-                  <wp:extent cx="731520" cy="731520"/>
-                  <wp:docPr id="2" name="Picture 2"/>
-                  <wp:cNvGraphicFramePr>
-                    <a:graphicFrameLocks noChangeAspect="1"/>
-                  </wp:cNvGraphicFramePr>
-                  <a:graphic>
-                    <a:graphicData uri="http://schemas.openxmlformats.org/drawingml/2006/picture">
-                      <pic:pic>
-                        <pic:nvPicPr>
-                          <pic:cNvPr id="0" name="qr_mail.png"/>
-                          <pic:cNvPicPr/>
-                        </pic:nvPicPr>
-                        <pic:blipFill>
-                          <a:blip r:embed="rId10"/>
-                          <a:stretch>
-                            <a:fillRect/>
-                          </a:stretch>
-                        </pic:blipFill>
-                        <pic:spPr>
-                          <a:xfrm>
-                            <a:off x="0" y="0"/>
-                            <a:ext cx="731520" cy="731520"/>
-                          </a:xfrm>
-                          <a:prstGeom prst="rect"/>
-                        </pic:spPr>
-                      </pic:pic>
-                    </a:graphicData>
-                  </a:graphic>
-                </wp:inline>
-              </w:drawing>
-            </w:r>
-            <w:r>
-              <w:t xml:space="preserve">  </w:t>
-            </w:r>
           </w:p>
           <w:p>
             <w:pPr>
@@ -227,7 +237,7 @@
                 <w:color w:val="444444"/>
                 <w:sz w:val="15"/>
               </w:rPr>
-              <w:t xml:space="preserve">Résumé              Email  </w:t>
+              <w:t xml:space="preserve">Email   </w:t>
             </w:r>
           </w:p>
         </w:tc>

</xml_diff>